<commit_message>
Add Session 4: Visualization with matplotlib, seaborn and plotly
</commit_message>
<xml_diff>
--- a/Data_analysis_of_ARENA_.docx
+++ b/Data_analysis_of_ARENA_.docx
@@ -1184,6 +1184,13 @@
           <w:lang w:val="en-PK"/>
         </w:rPr>
         <w:t>Dropped zero</w:t>
+      </w:r>
+      <w:r>
+        <w:rPr>
+          <w:b/>
+          <w:bCs/>
+          <w:lang w:val="en-PK"/>
+        </w:rPr>
         <w:noBreakHyphen/>
         <w:t>variance columns –</w:t>
       </w:r>
@@ -1537,6 +1544,11 @@
           <w:lang w:val="en-PK"/>
         </w:rPr>
         <w:t>) using the median. I also filled platform</w:t>
+      </w:r>
+      <w:r>
+        <w:rPr>
+          <w:lang w:val="en-PK"/>
+        </w:rPr>
         <w:noBreakHyphen/>
         <w:t>related columns and tournaments_hosted with 0. Finally, I verified with </w:t>
       </w:r>
@@ -1688,6 +1700,263 @@
     </w:p>
     <w:p>
       <w:pPr>
+        <w:pStyle w:val="ListParagraph"/>
+        <w:numPr>
+          <w:ilvl w:val="0"/>
+          <w:numId w:val="14"/>
+        </w:numPr>
+        <w:spacing w:line="276" w:lineRule="auto"/>
+        <w:rPr>
+          <w:lang w:val="en-PK"/>
+        </w:rPr>
+      </w:pPr>
+      <w:r>
+        <w:rPr>
+          <w:b/>
+          <w:bCs/>
+          <w:lang w:val="en-PK"/>
+        </w:rPr>
+        <w:t xml:space="preserve">Average </w:t>
+      </w:r>
+      <w:proofErr w:type="spellStart"/>
+      <w:r>
+        <w:rPr>
+          <w:b/>
+          <w:bCs/>
+          <w:lang w:val="en-PK"/>
+        </w:rPr>
+        <w:t>member_count</w:t>
+      </w:r>
+      <w:proofErr w:type="spellEnd"/>
+      <w:r>
+        <w:rPr>
+          <w:b/>
+          <w:bCs/>
+          <w:lang w:val="en-PK"/>
+        </w:rPr>
+        <w:t xml:space="preserve"> per genre –</w:t>
+      </w:r>
+      <w:r>
+        <w:rPr>
+          <w:lang w:val="en-PK"/>
+        </w:rPr>
+        <w:t xml:space="preserve"> I split the genre column, joined it with the member_count column, and aggregated </w:t>
+      </w:r>
+      <w:proofErr w:type="gramStart"/>
+      <w:r>
+        <w:rPr>
+          <w:lang w:val="en-PK"/>
+        </w:rPr>
+        <w:t xml:space="preserve">with </w:t>
+      </w:r>
+      <w:r>
+        <w:rPr>
+          <w:rFonts w:ascii="Consolas" w:hAnsi="Consolas"/>
+          <w:sz w:val="18"/>
+          <w:szCs w:val="18"/>
+          <w:lang w:val="en-PK"/>
+        </w:rPr>
+        <w:t>.mean</w:t>
+      </w:r>
+      <w:proofErr w:type="gramEnd"/>
+      <w:r>
+        <w:rPr>
+          <w:rFonts w:ascii="Consolas" w:hAnsi="Consolas"/>
+          <w:sz w:val="18"/>
+          <w:szCs w:val="18"/>
+          <w:lang w:val="en-PK"/>
+        </w:rPr>
+        <w:t>()</w:t>
+      </w:r>
+      <w:r>
+        <w:rPr>
+          <w:lang w:val="en-PK"/>
+        </w:rPr>
+        <w:t>.</w:t>
+      </w:r>
+    </w:p>
+    <w:p>
+      <w:pPr>
+        <w:pStyle w:val="ListParagraph"/>
+        <w:spacing w:line="276" w:lineRule="auto"/>
+        <w:rPr>
+          <w:lang w:val="en-PK"/>
+        </w:rPr>
+      </w:pPr>
+      <w:r>
+        <w:rPr>
+          <w:lang w:val="en-PK"/>
+        </w:rPr>
+        <w:t>Result: A series showing the average community size per genre. The genre with the highest average community size was Fighting (5,596.44 members).</w:t>
+      </w:r>
+    </w:p>
+    <w:p>
+      <w:pPr>
+        <w:pStyle w:val="ListParagraph"/>
+        <w:numPr>
+          <w:ilvl w:val="0"/>
+          <w:numId w:val="14"/>
+        </w:numPr>
+        <w:spacing w:line="276" w:lineRule="auto"/>
+        <w:rPr>
+          <w:lang w:val="en-PK"/>
+        </w:rPr>
+      </w:pPr>
+      <w:r>
+        <w:rPr>
+          <w:b/>
+          <w:bCs/>
+          <w:lang w:val="en-PK"/>
+        </w:rPr>
+        <w:t>Total tournaments per community_tier –</w:t>
+      </w:r>
+      <w:r>
+        <w:rPr>
+          <w:lang w:val="en-PK"/>
+        </w:rPr>
+        <w:t xml:space="preserve"> I split the community_tier column, joined it with the tournaments_hosted column, and aggregated </w:t>
+      </w:r>
+      <w:proofErr w:type="gramStart"/>
+      <w:r>
+        <w:rPr>
+          <w:lang w:val="en-PK"/>
+        </w:rPr>
+        <w:t>with .sum</w:t>
+      </w:r>
+      <w:proofErr w:type="gramEnd"/>
+      <w:r>
+        <w:rPr>
+          <w:lang w:val="en-PK"/>
+        </w:rPr>
+        <w:t>().</w:t>
+      </w:r>
+    </w:p>
+    <w:p>
+      <w:pPr>
+        <w:pStyle w:val="ListParagraph"/>
+        <w:spacing w:line="276" w:lineRule="auto"/>
+        <w:rPr>
+          <w:lang w:val="en-PK"/>
+        </w:rPr>
+      </w:pPr>
+      <w:r>
+        <w:rPr>
+          <w:lang w:val="en-PK"/>
+        </w:rPr>
+        <w:t>Result: A series showing tournaments hosted by each community tier. Semi</w:t>
+      </w:r>
+      <w:r>
+        <w:rPr>
+          <w:lang w:val="en-PK"/>
+        </w:rPr>
+        <w:noBreakHyphen/>
+        <w:t>Pro hosted the most tournaments (525), followed by Professional (123). Amateur and Elite hosted very few.</w:t>
+      </w:r>
+    </w:p>
+    <w:p>
+      <w:pPr>
+        <w:pStyle w:val="ListParagraph"/>
+        <w:numPr>
+          <w:ilvl w:val="0"/>
+          <w:numId w:val="14"/>
+        </w:numPr>
+        <w:spacing w:line="276" w:lineRule="auto"/>
+        <w:rPr>
+          <w:lang w:val="en-PK"/>
+        </w:rPr>
+      </w:pPr>
+      <w:r>
+        <w:rPr>
+          <w:lang w:val="en-PK"/>
+        </w:rPr>
+        <w:t>Median active players per primary_platform – I split the primary_platform column, joined it with the active_players column, and aggregated with .median().</w:t>
+      </w:r>
+    </w:p>
+    <w:p>
+      <w:pPr>
+        <w:pStyle w:val="ListParagraph"/>
+        <w:spacing w:line="276" w:lineRule="auto"/>
+        <w:rPr>
+          <w:lang w:val="en-PK"/>
+        </w:rPr>
+      </w:pPr>
+      <w:r>
+        <w:rPr>
+          <w:lang w:val="en-PK"/>
+        </w:rPr>
+        <w:t>Result: A series with the median active players per platform. Twitter/X had the highest median (311.0), followed by Twitch (303.0), YouTube (254.5), and others.</w:t>
+      </w:r>
+    </w:p>
+    <w:p>
+      <w:pPr>
+        <w:pStyle w:val="ListParagraph"/>
+        <w:numPr>
+          <w:ilvl w:val="0"/>
+          <w:numId w:val="14"/>
+        </w:numPr>
+        <w:spacing w:line="276" w:lineRule="auto"/>
+        <w:rPr>
+          <w:lang w:val="en-PK"/>
+        </w:rPr>
+      </w:pPr>
+      <w:r>
+        <w:rPr>
+          <w:lang w:val="en-PK"/>
+        </w:rPr>
+        <w:t>Min/max average member age per region – I split the region column, joined it with avg_member_age, and aggregated with both min and max.</w:t>
+      </w:r>
+    </w:p>
+    <w:p>
+      <w:pPr>
+        <w:pStyle w:val="ListParagraph"/>
+        <w:spacing w:line="276" w:lineRule="auto"/>
+        <w:rPr>
+          <w:lang w:val="en-PK"/>
+        </w:rPr>
+      </w:pPr>
+      <w:r>
+        <w:rPr>
+          <w:lang w:val="en-PK"/>
+        </w:rPr>
+        <w:t>Result: A DataFrame showing each region’s minimum and maximum average member age. EU (Europe) had the youngest minimum average age (14.0) and a maximum of 37.9.</w:t>
+      </w:r>
+    </w:p>
+    <w:p>
+      <w:pPr>
+        <w:pStyle w:val="ListParagraph"/>
+        <w:numPr>
+          <w:ilvl w:val="0"/>
+          <w:numId w:val="14"/>
+        </w:numPr>
+        <w:spacing w:line="276" w:lineRule="auto"/>
+        <w:rPr>
+          <w:lang w:val="en-PK"/>
+        </w:rPr>
+      </w:pPr>
+      <w:r>
+        <w:rPr>
+          <w:lang w:val="en-PK"/>
+        </w:rPr>
+        <w:t>Language counts – I split the language column, joined it with the community_name column, and aggregated with .count().</w:t>
+      </w:r>
+    </w:p>
+    <w:p>
+      <w:pPr>
+        <w:pStyle w:val="ListParagraph"/>
+        <w:spacing w:line="276" w:lineRule="auto"/>
+        <w:rPr>
+          <w:lang w:val="en-PK"/>
+        </w:rPr>
+      </w:pPr>
+      <w:r>
+        <w:rPr>
+          <w:lang w:val="en-PK"/>
+        </w:rPr>
+        <w:t>Result: A series of language frequencies. The top three most common languages were English (141), Spanish (62), and Portuguese (32).</w:t>
+      </w:r>
+    </w:p>
+    <w:p>
+      <w:pPr>
         <w:spacing w:line="276" w:lineRule="auto"/>
         <w:rPr>
           <w:b/>
@@ -1705,179 +1974,164 @@
           <w:szCs w:val="24"/>
           <w:lang w:val="en-PK"/>
         </w:rPr>
-        <w:t>Part A: Basic GroupBy (Single Column)</w:t>
-      </w:r>
-    </w:p>
-    <w:p>
-      <w:pPr>
-        <w:pStyle w:val="ListParagraph"/>
-        <w:numPr>
-          <w:ilvl w:val="0"/>
-          <w:numId w:val="14"/>
-        </w:numPr>
-        <w:spacing w:line="276" w:lineRule="auto"/>
-        <w:rPr>
-          <w:lang w:val="en-PK"/>
-        </w:rPr>
-      </w:pPr>
-      <w:r>
-        <w:rPr>
-          <w:lang w:val="en-PK"/>
-        </w:rPr>
-        <w:t>Average member_count per genre – I split the genre column, joined it with the member_count column, and aggregated with .mean().</w:t>
-      </w:r>
-    </w:p>
-    <w:p>
-      <w:pPr>
-        <w:pStyle w:val="ListParagraph"/>
-        <w:spacing w:line="276" w:lineRule="auto"/>
-        <w:rPr>
-          <w:lang w:val="en-PK"/>
-        </w:rPr>
-      </w:pPr>
-      <w:r>
-        <w:rPr>
-          <w:lang w:val="en-PK"/>
-        </w:rPr>
-        <w:t>Result: A series showing the average community size per genre. The genre with the highest average community size was Fighting (5,596.44 members).</w:t>
-      </w:r>
-    </w:p>
-    <w:p>
-      <w:pPr>
-        <w:pStyle w:val="ListParagraph"/>
-        <w:numPr>
-          <w:ilvl w:val="0"/>
-          <w:numId w:val="14"/>
-        </w:numPr>
-        <w:spacing w:line="276" w:lineRule="auto"/>
-        <w:rPr>
-          <w:lang w:val="en-PK"/>
-        </w:rPr>
-      </w:pPr>
-      <w:r>
-        <w:rPr>
-          <w:lang w:val="en-PK"/>
-        </w:rPr>
-        <w:t>Total tournaments per community_tier – I split the community_tier column, joined it with the tournaments_hosted column, and aggregated with .sum().</w:t>
-      </w:r>
-    </w:p>
-    <w:p>
-      <w:pPr>
-        <w:pStyle w:val="ListParagraph"/>
-        <w:spacing w:line="276" w:lineRule="auto"/>
-        <w:rPr>
-          <w:lang w:val="en-PK"/>
-        </w:rPr>
-      </w:pPr>
-      <w:r>
-        <w:rPr>
-          <w:lang w:val="en-PK"/>
-        </w:rPr>
-        <w:t>Result: A series showing tournaments hosted by each community tier. Semi</w:t>
-        <w:noBreakHyphen/>
-        <w:t>Pro hosted the most tournaments (525), followed by Professional (123). Amateur and Elite hosted very few.</w:t>
-      </w:r>
-    </w:p>
-    <w:p>
-      <w:pPr>
-        <w:pStyle w:val="ListParagraph"/>
-        <w:numPr>
-          <w:ilvl w:val="0"/>
-          <w:numId w:val="14"/>
-        </w:numPr>
-        <w:spacing w:line="276" w:lineRule="auto"/>
-        <w:rPr>
-          <w:lang w:val="en-PK"/>
-        </w:rPr>
-      </w:pPr>
-      <w:r>
-        <w:rPr>
-          <w:lang w:val="en-PK"/>
-        </w:rPr>
-        <w:t>Median active players per primary_platform – I split the primary_platform column, joined it with the active_players column, and aggregated with .median().</w:t>
-      </w:r>
-    </w:p>
-    <w:p>
-      <w:pPr>
-        <w:pStyle w:val="ListParagraph"/>
-        <w:spacing w:line="276" w:lineRule="auto"/>
-        <w:rPr>
-          <w:lang w:val="en-PK"/>
-        </w:rPr>
-      </w:pPr>
-      <w:r>
-        <w:rPr>
-          <w:lang w:val="en-PK"/>
-        </w:rPr>
-        <w:t>Result: A series with the median active players per platform. Twitter/X had the highest median (311.0), followed by Twitch (303.0), YouTube (254.5), and others.</w:t>
-      </w:r>
-    </w:p>
-    <w:p>
-      <w:pPr>
-        <w:pStyle w:val="ListParagraph"/>
-        <w:numPr>
-          <w:ilvl w:val="0"/>
-          <w:numId w:val="14"/>
-        </w:numPr>
-        <w:spacing w:line="276" w:lineRule="auto"/>
-        <w:rPr>
-          <w:lang w:val="en-PK"/>
-        </w:rPr>
-      </w:pPr>
-      <w:r>
-        <w:rPr>
-          <w:lang w:val="en-PK"/>
-        </w:rPr>
-        <w:t>Min/max average member age per region – I split the region column, joined it with avg_member_age, and aggregated with both min and max.</w:t>
-      </w:r>
-    </w:p>
-    <w:p>
-      <w:pPr>
-        <w:pStyle w:val="ListParagraph"/>
-        <w:spacing w:line="276" w:lineRule="auto"/>
-        <w:rPr>
-          <w:lang w:val="en-PK"/>
-        </w:rPr>
-      </w:pPr>
-      <w:r>
-        <w:rPr>
-          <w:lang w:val="en-PK"/>
-        </w:rPr>
-        <w:t>Result: A DataFrame showing each region’s minimum and maximum average member age. EU (Europe) had the youngest minimum average age (14.0) and a maximum of 37.9.</w:t>
-      </w:r>
-    </w:p>
-    <w:p>
-      <w:pPr>
-        <w:pStyle w:val="ListParagraph"/>
-        <w:numPr>
-          <w:ilvl w:val="0"/>
-          <w:numId w:val="14"/>
-        </w:numPr>
-        <w:spacing w:line="276" w:lineRule="auto"/>
-        <w:rPr>
-          <w:lang w:val="en-PK"/>
-        </w:rPr>
-      </w:pPr>
-      <w:r>
-        <w:rPr>
-          <w:lang w:val="en-PK"/>
-        </w:rPr>
-        <w:t>Language counts – I split the language column, joined it with the community_name column, and aggregated with .count().</w:t>
-      </w:r>
-    </w:p>
-    <w:p>
-      <w:pPr>
-        <w:pStyle w:val="ListParagraph"/>
-        <w:spacing w:line="276" w:lineRule="auto"/>
-        <w:rPr>
-          <w:lang w:val="en-PK"/>
-        </w:rPr>
-      </w:pPr>
-      <w:r>
-        <w:rPr>
-          <w:lang w:val="en-PK"/>
-        </w:rPr>
-        <w:t>Result: A series of language frequencies. The top three most common languages were English (141), Spanish (62), and Portuguese (32).</w:t>
+        <w:t>Part B: Multiple Aggregations and Custom Functions</w:t>
+      </w:r>
+    </w:p>
+    <w:p>
+      <w:pPr>
+        <w:spacing w:line="276" w:lineRule="auto"/>
+        <w:rPr>
+          <w:lang w:val="en-PK"/>
+        </w:rPr>
+      </w:pPr>
+      <w:r>
+        <w:rPr>
+          <w:lang w:val="en-PK"/>
+        </w:rPr>
+        <w:t>6. .agg() on genre – mean members, sum tournaments, median rank – I grouped by genre and aggregated: mean of member_count, sum of tournaments_hosted, and median of top_player_rank.</w:t>
+      </w:r>
+    </w:p>
+    <w:p>
+      <w:pPr>
+        <w:spacing w:line="276" w:lineRule="auto"/>
+        <w:rPr>
+          <w:lang w:val="en-PK"/>
+        </w:rPr>
+      </w:pPr>
+      <w:r>
+        <w:rPr>
+          <w:lang w:val="en-PK"/>
+        </w:rPr>
+        <w:lastRenderedPageBreak/>
+        <w:t>Result: A DataFrame with genre as index. Fighting had the highest average member count; FPS hosted the most tournaments (361) and also had the highest (worst) median rank.</w:t>
+      </w:r>
+    </w:p>
+    <w:p>
+      <w:pPr>
+        <w:spacing w:line="276" w:lineRule="auto"/>
+        <w:rPr>
+          <w:lang w:val="en-PK"/>
+        </w:rPr>
+      </w:pPr>
+      <w:r>
+        <w:rPr>
+          <w:lang w:val="en-PK"/>
+        </w:rPr>
+        <w:t>7. Top 5 countries by total members – I grouped by country_of_origin, summed member_count, sorted descending, and took the first five using .iloc[:5].</w:t>
+      </w:r>
+    </w:p>
+    <w:p>
+      <w:pPr>
+        <w:spacing w:line="276" w:lineRule="auto"/>
+        <w:rPr>
+          <w:lang w:val="en-PK"/>
+        </w:rPr>
+      </w:pPr>
+      <w:r>
+        <w:rPr>
+          <w:lang w:val="en-PK"/>
+        </w:rPr>
+        <w:t>Result: A series of total members per country (descending). United States had the highest total (202,982), followed by Taiwan (174,737), Mexico (146,408), China (104,804), and South Africa (74,034).</w:t>
+      </w:r>
+    </w:p>
+    <w:p>
+      <w:pPr>
+        <w:spacing w:line="276" w:lineRule="auto"/>
+        <w:rPr>
+          <w:lang w:val="en-PK"/>
+        </w:rPr>
+      </w:pPr>
+      <w:r>
+        <w:rPr>
+          <w:lang w:val="en-PK"/>
+        </w:rPr>
+        <w:t>8. Standard deviation of member counts per tier – I grouped by community_tier and computed the standard deviation of member_count using .std().</w:t>
+      </w:r>
+    </w:p>
+    <w:p>
+      <w:pPr>
+        <w:spacing w:line="276" w:lineRule="auto"/>
+        <w:rPr>
+          <w:lang w:val="en-PK"/>
+        </w:rPr>
+      </w:pPr>
+      <w:r>
+        <w:rPr>
+          <w:lang w:val="en-PK"/>
+        </w:rPr>
+        <w:t>Result: A series showing the variability of community sizes within each tier. The Professional tier had the highest standard deviation, indicating the widest range of sizes.</w:t>
+      </w:r>
+    </w:p>
+    <w:p>
+      <w:pPr>
+        <w:spacing w:line="276" w:lineRule="auto"/>
+        <w:rPr>
+          <w:lang w:val="en-PK"/>
+        </w:rPr>
+      </w:pPr>
+      <w:r>
+        <w:rPr>
+          <w:lang w:val="en-PK"/>
+        </w:rPr>
+        <w:t>9. Distinct primary games per genre – I grouped by genre and used .nunique() on primary_game.</w:t>
+      </w:r>
+    </w:p>
+    <w:p>
+      <w:pPr>
+        <w:spacing w:line="276" w:lineRule="auto"/>
+        <w:rPr>
+          <w:lang w:val="en-PK"/>
+        </w:rPr>
+      </w:pPr>
+      <w:r>
+        <w:rPr>
+          <w:lang w:val="en-PK"/>
+        </w:rPr>
+        <w:t>Result: A series of the number of distinct primary games in each genre. FPS had the most diverse set of games (5).</w:t>
+      </w:r>
+    </w:p>
+    <w:p>
+      <w:pPr>
+        <w:spacing w:line="276" w:lineRule="auto"/>
+        <w:rPr>
+          <w:lang w:val="en-PK"/>
+        </w:rPr>
+      </w:pPr>
+      <w:r>
+        <w:rPr>
+          <w:lang w:val="en-PK"/>
+        </w:rPr>
+        <w:t>10. Discord/Reddit ratio per region – I created a new column discord_to_reddit_ratio = discord_server_size / reddit_community_size. I replaced infinite and missing values with 0. Then I grouped by region and took the mean.</w:t>
+      </w:r>
+    </w:p>
+    <w:p>
+      <w:pPr>
+        <w:spacing w:line="276" w:lineRule="auto"/>
+        <w:rPr>
+          <w:lang w:val="en-PK"/>
+        </w:rPr>
+      </w:pPr>
+      <w:r>
+        <w:rPr>
+          <w:lang w:val="en-PK"/>
+        </w:rPr>
+        <w:t>Result: A series of the average Discord/Reddit ratio per region. OC (Oceania) relied most on Discord relative to Reddit.</w:t>
+      </w:r>
+    </w:p>
+    <w:p>
+      <w:pPr>
+        <w:spacing w:line="276" w:lineRule="auto"/>
+        <w:rPr>
+          <w:lang w:val="en-PK"/>
+        </w:rPr>
+      </w:pPr>
+      <w:r>
+        <w:rPr>
+          <w:lang w:val="en-PK"/>
+        </w:rPr>
+        <w:pict w14:anchorId="5DC3CF0E">
+          <v:rect id="_x0000_i1025" style="width:0;height:.75pt" o:hralign="center" o:hrstd="t" o:hr="t" fillcolor="#a0a0a0" stroked="f"/>
+        </w:pict>
       </w:r>
     </w:p>
     <w:p>
@@ -1899,169 +2153,9 @@
           <w:szCs w:val="24"/>
           <w:lang w:val="en-PK"/>
         </w:rPr>
-        <w:t>Part B: Multiple Aggregations and Custom Functions</w:t>
-      </w:r>
-    </w:p>
-    <w:p>
-      <w:pPr>
-        <w:spacing w:line="276" w:lineRule="auto"/>
-        <w:rPr>
-          <w:lang w:val="en-PK"/>
-        </w:rPr>
-      </w:pPr>
-      <w:r>
-        <w:rPr>
-          <w:lang w:val="en-PK"/>
-        </w:rPr>
-        <w:lastRenderedPageBreak/>
-        <w:t>6. .agg() on genre – mean members, sum tournaments, median rank – I grouped by genre and aggregated: mean of member_count, sum of tournaments_hosted, and median of top_player_rank.</w:t>
-      </w:r>
-    </w:p>
-    <w:p>
-      <w:pPr>
-        <w:spacing w:line="276" w:lineRule="auto"/>
-        <w:rPr>
-          <w:lang w:val="en-PK"/>
-        </w:rPr>
-      </w:pPr>
-      <w:r>
-        <w:rPr>
-          <w:lang w:val="en-PK"/>
-        </w:rPr>
-        <w:t>Result: A DataFrame with genre as index. Fighting had the highest average member count; FPS hosted the most tournaments (361) and also had the highest (worst) median rank.</w:t>
-      </w:r>
-    </w:p>
-    <w:p>
-      <w:pPr>
-        <w:spacing w:line="276" w:lineRule="auto"/>
-        <w:rPr>
-          <w:lang w:val="en-PK"/>
-        </w:rPr>
-      </w:pPr>
-      <w:r>
-        <w:rPr>
-          <w:lang w:val="en-PK"/>
-        </w:rPr>
-        <w:t>7. Top 5 countries by total members – I grouped by country_of_origin, summed member_count, sorted descending, and took the first five using .iloc[:5].</w:t>
-      </w:r>
-    </w:p>
-    <w:p>
-      <w:pPr>
-        <w:spacing w:line="276" w:lineRule="auto"/>
-        <w:rPr>
-          <w:lang w:val="en-PK"/>
-        </w:rPr>
-      </w:pPr>
-      <w:r>
-        <w:rPr>
-          <w:lang w:val="en-PK"/>
-        </w:rPr>
-        <w:t>Result: A series of total members per country (descending). United States had the highest total (202,982), followed by Taiwan (174,737), Mexico (146,408), China (104,804), and South Africa (74,034).</w:t>
-      </w:r>
-    </w:p>
-    <w:p>
-      <w:pPr>
-        <w:spacing w:line="276" w:lineRule="auto"/>
-        <w:rPr>
-          <w:lang w:val="en-PK"/>
-        </w:rPr>
-      </w:pPr>
-      <w:r>
-        <w:rPr>
-          <w:lang w:val="en-PK"/>
-        </w:rPr>
-        <w:t>8. Standard deviation of member counts per tier – I grouped by community_tier and computed the standard deviation of member_count using .std().</w:t>
-      </w:r>
-    </w:p>
-    <w:p>
-      <w:pPr>
-        <w:spacing w:line="276" w:lineRule="auto"/>
-        <w:rPr>
-          <w:lang w:val="en-PK"/>
-        </w:rPr>
-      </w:pPr>
-      <w:r>
-        <w:rPr>
-          <w:lang w:val="en-PK"/>
-        </w:rPr>
-        <w:t>Result: A series showing the variability of community sizes within each tier. The Professional tier had the highest standard deviation, indicating the widest range of sizes.</w:t>
-      </w:r>
-    </w:p>
-    <w:p>
-      <w:pPr>
-        <w:spacing w:line="276" w:lineRule="auto"/>
-        <w:rPr>
-          <w:lang w:val="en-PK"/>
-        </w:rPr>
-      </w:pPr>
-      <w:r>
-        <w:rPr>
-          <w:lang w:val="en-PK"/>
-        </w:rPr>
-        <w:t>9. Distinct primary games per genre – I grouped by genre and used .nunique() on primary_game.</w:t>
-      </w:r>
-    </w:p>
-    <w:p>
-      <w:pPr>
-        <w:spacing w:line="276" w:lineRule="auto"/>
-        <w:rPr>
-          <w:lang w:val="en-PK"/>
-        </w:rPr>
-      </w:pPr>
-      <w:r>
-        <w:rPr>
-          <w:lang w:val="en-PK"/>
-        </w:rPr>
-        <w:t>Result: A series of the number of distinct primary games in each genre. FPS had the most diverse set of games (5).</w:t>
-      </w:r>
-    </w:p>
-    <w:p>
-      <w:pPr>
-        <w:spacing w:line="276" w:lineRule="auto"/>
-        <w:rPr>
-          <w:lang w:val="en-PK"/>
-        </w:rPr>
-      </w:pPr>
-      <w:r>
-        <w:rPr>
-          <w:lang w:val="en-PK"/>
-        </w:rPr>
-        <w:t>10. Discord/Reddit ratio per region – I created a new column discord_to_reddit_ratio = discord_server_size / reddit_community_size. I replaced infinite and missing values with 0. Then I grouped by region and took the mean.</w:t>
-      </w:r>
-    </w:p>
-    <w:p>
-      <w:pPr>
-        <w:spacing w:line="276" w:lineRule="auto"/>
-        <w:rPr>
-          <w:lang w:val="en-PK"/>
-        </w:rPr>
-      </w:pPr>
-      <w:r>
-        <w:rPr>
-          <w:lang w:val="en-PK"/>
-        </w:rPr>
-        <w:t>Result: A series of the average Discord/Reddit ratio per region. OC (Oceania) relied most on Discord relative to Reddit.</w:t>
-      </w:r>
-    </w:p>
-    <w:p>
-      <w:pPr>
-        <w:spacing w:line="276" w:lineRule="auto"/>
-        <w:rPr>
-          <w:lang w:val="en-PK"/>
-        </w:rPr>
-      </w:pPr>
-      <w:r>
-        <w:rPr>
-          <w:lang w:val="en-PK"/>
-        </w:rPr>
-        <w:pict w14:anchorId="5DC3CF0E">
-          <v:rect id="_x0000_i1056" style="width:0;height:.75pt" o:hralign="center" o:hrstd="t" o:hr="t" fillcolor="#a0a0a0" stroked="f"/>
-        </w:pict>
-      </w:r>
-    </w:p>
-    <w:p>
-      <w:pPr>
-        <w:spacing w:line="276" w:lineRule="auto"/>
+        <w:t>Part C: Multi</w:t>
+      </w:r>
+      <w:r>
         <w:rPr>
           <w:b/>
           <w:bCs/>
@@ -2069,8 +2163,149 @@
           <w:szCs w:val="24"/>
           <w:lang w:val="en-PK"/>
         </w:rPr>
-      </w:pPr>
-      <w:r>
+        <w:noBreakHyphen/>
+        <w:t>Level Grouping</w:t>
+      </w:r>
+    </w:p>
+    <w:p>
+      <w:pPr>
+        <w:spacing w:line="276" w:lineRule="auto"/>
+        <w:rPr>
+          <w:lang w:val="en-PK"/>
+        </w:rPr>
+      </w:pPr>
+      <w:r>
+        <w:rPr>
+          <w:lang w:val="en-PK"/>
+        </w:rPr>
+        <w:t>11. Community counts per genre + community_tier – I grouped by both genre and community_tier, then used .size() to count communities in each combination.</w:t>
+      </w:r>
+    </w:p>
+    <w:p>
+      <w:pPr>
+        <w:spacing w:line="276" w:lineRule="auto"/>
+        <w:rPr>
+          <w:lang w:val="en-PK"/>
+        </w:rPr>
+      </w:pPr>
+      <w:r>
+        <w:rPr>
+          <w:lang w:val="en-PK"/>
+        </w:rPr>
+        <w:t>Result: A DataFrame with columns genre, community_tier, and count. FPS + Amateur was the most common combination (83 communities).</w:t>
+      </w:r>
+    </w:p>
+    <w:p>
+      <w:pPr>
+        <w:spacing w:line="276" w:lineRule="auto"/>
+        <w:rPr>
+          <w:lang w:val="en-PK"/>
+        </w:rPr>
+      </w:pPr>
+      <w:r>
+        <w:rPr>
+          <w:lang w:val="en-PK"/>
+        </w:rPr>
+        <w:t>12. Average active players per region + primary_platform – I grouped by region and primary_platform, then computed the mean of active_players.</w:t>
+      </w:r>
+    </w:p>
+    <w:p>
+      <w:pPr>
+        <w:spacing w:line="276" w:lineRule="auto"/>
+        <w:rPr>
+          <w:lang w:val="en-PK"/>
+        </w:rPr>
+      </w:pPr>
+      <w:r>
+        <w:rPr>
+          <w:lang w:val="en-PK"/>
+        </w:rPr>
+        <w:t>Result: A DataFrame showing average active players for each region</w:t>
+      </w:r>
+      <w:r>
+        <w:rPr>
+          <w:lang w:val="en-PK"/>
+        </w:rPr>
+        <w:noBreakHyphen/>
+        <w:t>platform pair. The highest was AS (Asia) + Twitch with about 3,696 active players.</w:t>
+      </w:r>
+    </w:p>
+    <w:p>
+      <w:pPr>
+        <w:spacing w:line="276" w:lineRule="auto"/>
+        <w:rPr>
+          <w:lang w:val="en-PK"/>
+        </w:rPr>
+      </w:pPr>
+      <w:r>
+        <w:rPr>
+          <w:lang w:val="en-PK"/>
+        </w:rPr>
+        <w:t>13. Total member count per year_founded + genre – I grouped by year_founded and genre, then summed member_count. I omitted rows with null year_founded.</w:t>
+      </w:r>
+    </w:p>
+    <w:p>
+      <w:pPr>
+        <w:spacing w:line="276" w:lineRule="auto"/>
+        <w:rPr>
+          <w:lang w:val="en-PK"/>
+        </w:rPr>
+      </w:pPr>
+      <w:r>
+        <w:rPr>
+          <w:lang w:val="en-PK"/>
+        </w:rPr>
+        <w:t>Result: A DataFrame showing total members per year per genre. 2019 FPS had the highest total (158,947 members).</w:t>
+      </w:r>
+    </w:p>
+    <w:p>
+      <w:pPr>
+        <w:spacing w:line="276" w:lineRule="auto"/>
+        <w:rPr>
+          <w:lang w:val="en-PK"/>
+        </w:rPr>
+      </w:pPr>
+      <w:r>
+        <w:rPr>
+          <w:lang w:val="en-PK"/>
+        </w:rPr>
+        <w:lastRenderedPageBreak/>
+        <w:t>14. Worst rank per language + community_tier – I grouped by language and community_tier, then took the maximum top_player_rank (worst rank).</w:t>
+      </w:r>
+    </w:p>
+    <w:p>
+      <w:pPr>
+        <w:spacing w:line="276" w:lineRule="auto"/>
+        <w:rPr>
+          <w:lang w:val="en-PK"/>
+        </w:rPr>
+      </w:pPr>
+      <w:r>
+        <w:rPr>
+          <w:lang w:val="en-PK"/>
+        </w:rPr>
+        <w:t>Result: A DataFrame with the worst rank for each combination. English + Amateur had the highest (worst) rank (9843).</w:t>
+      </w:r>
+    </w:p>
+    <w:p>
+      <w:pPr>
+        <w:spacing w:line="276" w:lineRule="auto"/>
+        <w:rPr>
+          <w:lang w:val="en-PK"/>
+        </w:rPr>
+      </w:pPr>
+      <w:r>
+        <w:rPr>
+          <w:lang w:val="en-PK"/>
+        </w:rPr>
+        <w:pict w14:anchorId="3BEB32E3">
+          <v:rect id="_x0000_i1026" style="width:0;height:.75pt" o:hralign="center" o:hrstd="t" o:hr="t" fillcolor="#a0a0a0" stroked="f"/>
+        </w:pict>
+      </w:r>
+    </w:p>
+    <w:p>
+      <w:pPr>
+        <w:spacing w:line="276" w:lineRule="auto"/>
         <w:rPr>
           <w:b/>
           <w:bCs/>
@@ -2078,145 +2313,8 @@
           <w:szCs w:val="24"/>
           <w:lang w:val="en-PK"/>
         </w:rPr>
-        <w:t>Part C: Multi</w:t>
-        <w:noBreakHyphen/>
-        <w:t>Level Grouping</w:t>
-      </w:r>
-    </w:p>
-    <w:p>
-      <w:pPr>
-        <w:spacing w:line="276" w:lineRule="auto"/>
-        <w:rPr>
-          <w:lang w:val="en-PK"/>
-        </w:rPr>
-      </w:pPr>
-      <w:r>
-        <w:rPr>
-          <w:lang w:val="en-PK"/>
-        </w:rPr>
-        <w:lastRenderedPageBreak/>
-        <w:t>11. Community counts per genre + community_tier – I grouped by both genre and community_tier, then used .size() to count communities in each combination.</w:t>
-      </w:r>
-    </w:p>
-    <w:p>
-      <w:pPr>
-        <w:spacing w:line="276" w:lineRule="auto"/>
-        <w:rPr>
-          <w:lang w:val="en-PK"/>
-        </w:rPr>
-      </w:pPr>
-      <w:r>
-        <w:rPr>
-          <w:lang w:val="en-PK"/>
-        </w:rPr>
-        <w:t>Result: A DataFrame with columns genre, community_tier, and count. FPS + Amateur was the most common combination (83 communities).</w:t>
-      </w:r>
-    </w:p>
-    <w:p>
-      <w:pPr>
-        <w:spacing w:line="276" w:lineRule="auto"/>
-        <w:rPr>
-          <w:lang w:val="en-PK"/>
-        </w:rPr>
-      </w:pPr>
-      <w:r>
-        <w:rPr>
-          <w:lang w:val="en-PK"/>
-        </w:rPr>
-        <w:t>12. Average active players per region + primary_platform – I grouped by region and primary_platform, then computed the mean of active_players.</w:t>
-      </w:r>
-    </w:p>
-    <w:p>
-      <w:pPr>
-        <w:spacing w:line="276" w:lineRule="auto"/>
-        <w:rPr>
-          <w:lang w:val="en-PK"/>
-        </w:rPr>
-      </w:pPr>
-      <w:r>
-        <w:rPr>
-          <w:lang w:val="en-PK"/>
-        </w:rPr>
-        <w:t>Result: A DataFrame showing average active players for each region</w:t>
-        <w:noBreakHyphen/>
-        <w:t>platform pair. The highest was AS (Asia) + Twitch with about 3,696 active players.</w:t>
-      </w:r>
-    </w:p>
-    <w:p>
-      <w:pPr>
-        <w:spacing w:line="276" w:lineRule="auto"/>
-        <w:rPr>
-          <w:lang w:val="en-PK"/>
-        </w:rPr>
-      </w:pPr>
-      <w:r>
-        <w:rPr>
-          <w:lang w:val="en-PK"/>
-        </w:rPr>
-        <w:t>13. Total member count per year_founded + genre – I grouped by year_founded and genre, then summed member_count. I omitted rows with null year_founded.</w:t>
-      </w:r>
-    </w:p>
-    <w:p>
-      <w:pPr>
-        <w:spacing w:line="276" w:lineRule="auto"/>
-        <w:rPr>
-          <w:lang w:val="en-PK"/>
-        </w:rPr>
-      </w:pPr>
-      <w:r>
-        <w:rPr>
-          <w:lang w:val="en-PK"/>
-        </w:rPr>
-        <w:t>Result: A DataFrame showing total members per year per genre. 2019 FPS had the highest total (158,947 members).</w:t>
-      </w:r>
-    </w:p>
-    <w:p>
-      <w:pPr>
-        <w:spacing w:line="276" w:lineRule="auto"/>
-        <w:rPr>
-          <w:lang w:val="en-PK"/>
-        </w:rPr>
-      </w:pPr>
-      <w:r>
-        <w:rPr>
-          <w:lang w:val="en-PK"/>
-        </w:rPr>
-        <w:t>14. Worst rank per language + community_tier – I grouped by language and community_tier, then took the maximum top_player_rank (worst rank).</w:t>
-      </w:r>
-    </w:p>
-    <w:p>
-      <w:pPr>
-        <w:spacing w:line="276" w:lineRule="auto"/>
-        <w:rPr>
-          <w:lang w:val="en-PK"/>
-        </w:rPr>
-      </w:pPr>
-      <w:r>
-        <w:rPr>
-          <w:lang w:val="en-PK"/>
-        </w:rPr>
-        <w:t>Result: A DataFrame with the worst rank for each combination. English + Amateur had the highest (worst) rank (9843).</w:t>
-      </w:r>
-    </w:p>
-    <w:p>
-      <w:pPr>
-        <w:spacing w:line="276" w:lineRule="auto"/>
-        <w:rPr>
-          <w:lang w:val="en-PK"/>
-        </w:rPr>
-      </w:pPr>
-      <w:r>
-        <w:rPr>
-          <w:lang w:val="en-PK"/>
-        </w:rPr>
-        <w:pict w14:anchorId="3BEB32E3">
-          <v:rect id="_x0000_i1057" style="width:0;height:.75pt" o:hralign="center" o:hrstd="t" o:hr="t" fillcolor="#a0a0a0" stroked="f"/>
-        </w:pict>
-      </w:r>
-    </w:p>
-    <w:p>
-      <w:pPr>
-        <w:spacing w:line="276" w:lineRule="auto"/>
+      </w:pPr>
+      <w:r>
         <w:rPr>
           <w:b/>
           <w:bCs/>
@@ -2224,8 +2322,154 @@
           <w:szCs w:val="24"/>
           <w:lang w:val="en-PK"/>
         </w:rPr>
-      </w:pPr>
-      <w:r>
+        <w:t>Part D: Ranking &amp; Filtering within Groups</w:t>
+      </w:r>
+    </w:p>
+    <w:p>
+      <w:pPr>
+        <w:spacing w:line="276" w:lineRule="auto"/>
+        <w:rPr>
+          <w:lang w:val="en-PK"/>
+        </w:rPr>
+      </w:pPr>
+      <w:r>
+        <w:rPr>
+          <w:lang w:val="en-PK"/>
+        </w:rPr>
+        <w:t>15. Largest community per genre – I used .groupby('genre')['member_count'].idxmax() to find the index of the largest community in each genre, then displayed genre, community_name, and member_count.</w:t>
+      </w:r>
+    </w:p>
+    <w:p>
+      <w:pPr>
+        <w:spacing w:line="276" w:lineRule="auto"/>
+        <w:rPr>
+          <w:lang w:val="en-PK"/>
+        </w:rPr>
+      </w:pPr>
+      <w:r>
+        <w:rPr>
+          <w:lang w:val="en-PK"/>
+        </w:rPr>
+        <w:t>Result: For example, Reaper Crew (FPS) had 68,819 members, the largest in its genre.</w:t>
+      </w:r>
+    </w:p>
+    <w:p>
+      <w:pPr>
+        <w:spacing w:line="276" w:lineRule="auto"/>
+        <w:rPr>
+          <w:lang w:val="en-PK"/>
+        </w:rPr>
+      </w:pPr>
+      <w:r>
+        <w:rPr>
+          <w:lang w:val="en-PK"/>
+        </w:rPr>
+        <w:t>16. Top active community per region – I added a column region_activity_rank by ranking active_players within each region (descending). Then I filtered for rank 1.</w:t>
+      </w:r>
+    </w:p>
+    <w:p>
+      <w:pPr>
+        <w:spacing w:line="276" w:lineRule="auto"/>
+        <w:rPr>
+          <w:lang w:val="en-PK"/>
+        </w:rPr>
+      </w:pPr>
+      <w:r>
+        <w:rPr>
+          <w:lang w:val="en-PK"/>
+        </w:rPr>
+        <w:t>Result: The most active community in Asia was Pulse Nation (23,727 active players). Other regions had their own top communities.</w:t>
+      </w:r>
+    </w:p>
+    <w:p>
+      <w:pPr>
+        <w:spacing w:line="276" w:lineRule="auto"/>
+        <w:rPr>
+          <w:lang w:val="en-PK"/>
+        </w:rPr>
+      </w:pPr>
+      <w:r>
+        <w:rPr>
+          <w:lang w:val="en-PK"/>
+        </w:rPr>
+        <w:t>17. Genres removed by tournament filter – I used .groupby('genre').filter(lambda x: x['tournaments_hosted'].sum() &gt; 50) to keep only genres with total tournaments &gt; 50. The removed genres were MMORPG, Strategy, and Fighting.</w:t>
+      </w:r>
+    </w:p>
+    <w:p>
+      <w:pPr>
+        <w:spacing w:line="276" w:lineRule="auto"/>
+        <w:rPr>
+          <w:lang w:val="en-PK"/>
+        </w:rPr>
+      </w:pPr>
+      <w:r>
+        <w:rPr>
+          <w:lang w:val="en-PK"/>
+        </w:rPr>
+        <w:t>18. Second largest community per tier – I sorted by community_tier and member_count (descending), then used .groupby('community_tier').nth(1) to get the second largest community in each tier.</w:t>
+      </w:r>
+    </w:p>
+    <w:p>
+      <w:pPr>
+        <w:spacing w:line="276" w:lineRule="auto"/>
+        <w:rPr>
+          <w:lang w:val="en-PK"/>
+        </w:rPr>
+      </w:pPr>
+      <w:r>
+        <w:rPr>
+          <w:lang w:val="en-PK"/>
+        </w:rPr>
+        <w:t>Result: For example, in the Amateur tier, the second largest was Dusk Raiders (1,879 members). For Elite, it was Pulse Nation (68,819).</w:t>
+      </w:r>
+    </w:p>
+    <w:p>
+      <w:pPr>
+        <w:spacing w:line="276" w:lineRule="auto"/>
+        <w:rPr>
+          <w:lang w:val="en-PK"/>
+        </w:rPr>
+      </w:pPr>
+      <w:r>
+        <w:rPr>
+          <w:lang w:val="en-PK"/>
+        </w:rPr>
+        <w:t>19. Percentage above region average – I added a column above_region_avg by comparing each community's member_count to the region mean (calculated with .transform('mean')). Then I computed the percentage of communities above their region average.</w:t>
+      </w:r>
+    </w:p>
+    <w:p>
+      <w:pPr>
+        <w:spacing w:line="276" w:lineRule="auto"/>
+        <w:rPr>
+          <w:lang w:val="en-PK"/>
+        </w:rPr>
+      </w:pPr>
+      <w:r>
+        <w:rPr>
+          <w:lang w:val="en-PK"/>
+        </w:rPr>
+        <w:t>Result: Only 18.8% of communities had a member count above their region's average.</w:t>
+      </w:r>
+    </w:p>
+    <w:p>
+      <w:pPr>
+        <w:spacing w:line="276" w:lineRule="auto"/>
+        <w:rPr>
+          <w:lang w:val="en-PK"/>
+        </w:rPr>
+      </w:pPr>
+      <w:r>
+        <w:rPr>
+          <w:lang w:val="en-PK"/>
+        </w:rPr>
+        <w:pict w14:anchorId="490C1065">
+          <v:rect id="_x0000_i1027" style="width:0;height:.75pt" o:hralign="center" o:hrstd="t" o:hr="t" fillcolor="#a0a0a0" stroked="f"/>
+        </w:pict>
+      </w:r>
+    </w:p>
+    <w:p>
+      <w:pPr>
+        <w:spacing w:line="276" w:lineRule="auto"/>
         <w:rPr>
           <w:b/>
           <w:bCs/>
@@ -2233,155 +2477,8 @@
           <w:szCs w:val="24"/>
           <w:lang w:val="en-PK"/>
         </w:rPr>
-        <w:t>Part D: Ranking &amp; Filtering within Groups</w:t>
-      </w:r>
-    </w:p>
-    <w:p>
-      <w:pPr>
-        <w:spacing w:line="276" w:lineRule="auto"/>
-        <w:rPr>
-          <w:lang w:val="en-PK"/>
-        </w:rPr>
-      </w:pPr>
-      <w:r>
-        <w:rPr>
-          <w:lang w:val="en-PK"/>
-        </w:rPr>
-        <w:t>15. Largest community per genre – I used .groupby('genre')['member_count'].idxmax() to find the index of the largest community in each genre, then displayed genre, community_name, and member_count.</w:t>
-      </w:r>
-    </w:p>
-    <w:p>
-      <w:pPr>
-        <w:spacing w:line="276" w:lineRule="auto"/>
-        <w:rPr>
-          <w:lang w:val="en-PK"/>
-        </w:rPr>
-      </w:pPr>
-      <w:r>
-        <w:rPr>
-          <w:lang w:val="en-PK"/>
-        </w:rPr>
-        <w:t>Result: For example, Reaper Crew (FPS) had 68,819 members, the largest in its genre.</w:t>
-      </w:r>
-    </w:p>
-    <w:p>
-      <w:pPr>
-        <w:spacing w:line="276" w:lineRule="auto"/>
-        <w:rPr>
-          <w:lang w:val="en-PK"/>
-        </w:rPr>
-      </w:pPr>
-      <w:r>
-        <w:rPr>
-          <w:lang w:val="en-PK"/>
-        </w:rPr>
-        <w:t>16. Top active community per region – I added a column region_activity_rank by ranking active_players within each region (descending). Then I filtered for rank 1.</w:t>
-      </w:r>
-    </w:p>
-    <w:p>
-      <w:pPr>
-        <w:spacing w:line="276" w:lineRule="auto"/>
-        <w:rPr>
-          <w:lang w:val="en-PK"/>
-        </w:rPr>
-      </w:pPr>
-      <w:r>
-        <w:rPr>
-          <w:lang w:val="en-PK"/>
-        </w:rPr>
-        <w:lastRenderedPageBreak/>
-        <w:t>Result: The most active community in Asia was Pulse Nation (23,727 active players). Other regions had their own top communities.</w:t>
-      </w:r>
-    </w:p>
-    <w:p>
-      <w:pPr>
-        <w:spacing w:line="276" w:lineRule="auto"/>
-        <w:rPr>
-          <w:lang w:val="en-PK"/>
-        </w:rPr>
-      </w:pPr>
-      <w:r>
-        <w:rPr>
-          <w:lang w:val="en-PK"/>
-        </w:rPr>
-        <w:t>17. Genres removed by tournament filter – I used .groupby('genre').filter(lambda x: x['tournaments_hosted'].sum() &gt; 50) to keep only genres with total tournaments &gt; 50. The removed genres were MMORPG, Strategy, and Fighting.</w:t>
-      </w:r>
-    </w:p>
-    <w:p>
-      <w:pPr>
-        <w:spacing w:line="276" w:lineRule="auto"/>
-        <w:rPr>
-          <w:lang w:val="en-PK"/>
-        </w:rPr>
-      </w:pPr>
-      <w:r>
-        <w:rPr>
-          <w:lang w:val="en-PK"/>
-        </w:rPr>
-        <w:t>18. Second largest community per tier – I sorted by community_tier and member_count (descending), then used .groupby('community_tier').nth(1) to get the second largest community in each tier.</w:t>
-      </w:r>
-    </w:p>
-    <w:p>
-      <w:pPr>
-        <w:spacing w:line="276" w:lineRule="auto"/>
-        <w:rPr>
-          <w:lang w:val="en-PK"/>
-        </w:rPr>
-      </w:pPr>
-      <w:r>
-        <w:rPr>
-          <w:lang w:val="en-PK"/>
-        </w:rPr>
-        <w:t>Result: For example, in the Amateur tier, the second largest was Dusk Raiders (1,879 members). For Elite, it was Pulse Nation (68,819).</w:t>
-      </w:r>
-    </w:p>
-    <w:p>
-      <w:pPr>
-        <w:spacing w:line="276" w:lineRule="auto"/>
-        <w:rPr>
-          <w:lang w:val="en-PK"/>
-        </w:rPr>
-      </w:pPr>
-      <w:r>
-        <w:rPr>
-          <w:lang w:val="en-PK"/>
-        </w:rPr>
-        <w:t>19. Percentage above region average – I added a column above_region_avg by comparing each community's member_count to the region mean (calculated with .transform('mean')). Then I computed the percentage of communities above their region average.</w:t>
-      </w:r>
-    </w:p>
-    <w:p>
-      <w:pPr>
-        <w:spacing w:line="276" w:lineRule="auto"/>
-        <w:rPr>
-          <w:lang w:val="en-PK"/>
-        </w:rPr>
-      </w:pPr>
-      <w:r>
-        <w:rPr>
-          <w:lang w:val="en-PK"/>
-        </w:rPr>
-        <w:t>Result: Only 18.8% of communities had a member count above their region's average.</w:t>
-      </w:r>
-    </w:p>
-    <w:p>
-      <w:pPr>
-        <w:spacing w:line="276" w:lineRule="auto"/>
-        <w:rPr>
-          <w:lang w:val="en-PK"/>
-        </w:rPr>
-      </w:pPr>
-      <w:r>
-        <w:rPr>
-          <w:lang w:val="en-PK"/>
-        </w:rPr>
-        <w:pict w14:anchorId="490C1065">
-          <v:rect id="_x0000_i1058" style="width:0;height:.75pt" o:hralign="center" o:hrstd="t" o:hr="t" fillcolor="#a0a0a0" stroked="f"/>
-        </w:pict>
-      </w:r>
-    </w:p>
-    <w:p>
-      <w:pPr>
-        <w:spacing w:line="276" w:lineRule="auto"/>
+      </w:pPr>
+      <w:r>
         <w:rPr>
           <w:b/>
           <w:bCs/>
@@ -2389,15 +2486,6 @@
           <w:szCs w:val="24"/>
           <w:lang w:val="en-PK"/>
         </w:rPr>
-      </w:pPr>
-      <w:r>
-        <w:rPr>
-          <w:b/>
-          <w:bCs/>
-          <w:sz w:val="24"/>
-          <w:szCs w:val="24"/>
-          <w:lang w:val="en-PK"/>
-        </w:rPr>
         <w:t>Part E: Feature Engineering (New Columns Created)</w:t>
       </w:r>
     </w:p>
@@ -2435,6 +2523,11 @@
           <w:lang w:val="en-PK"/>
         </w:rPr>
         <w:t>tier_score – mapped Amateur → 1, Semi</w:t>
+      </w:r>
+      <w:r>
+        <w:rPr>
+          <w:lang w:val="en-PK"/>
+        </w:rPr>
         <w:noBreakHyphen/>
         <w:t>Pro → 2, Professional → 3, Elite → 4.</w:t>
       </w:r>
@@ -2508,6 +2601,7 @@
         <w:rPr>
           <w:lang w:val="en-PK"/>
         </w:rPr>
+        <w:lastRenderedPageBreak/>
         <w:t>has_multiple_platforms = True if both discord_server_size and reddit_community_size are &gt; 0.</w:t>
       </w:r>
     </w:p>
@@ -2526,7 +2620,6 @@
         <w:rPr>
           <w:lang w:val="en-PK"/>
         </w:rPr>
-        <w:lastRenderedPageBreak/>
         <w:t>log_member_count = np.log1p(member_count).</w:t>
       </w:r>
     </w:p>
@@ -2700,7 +2793,7 @@
           <w:lang w:val="en-PK"/>
         </w:rPr>
         <w:pict w14:anchorId="6EDDDC0A">
-          <v:rect id="_x0000_i1059" style="width:0;height:.75pt" o:hralign="center" o:hrstd="t" o:hr="t" fillcolor="#a0a0a0" stroked="f"/>
+          <v:rect id="_x0000_i1028" style="width:0;height:.75pt" o:hralign="center" o:hrstd="t" o:hr="t" fillcolor="#a0a0a0" stroked="f"/>
         </w:pict>
       </w:r>
     </w:p>
@@ -2799,7 +2892,6 @@
         <w:rPr>
           <w:lang w:val="en-PK"/>
         </w:rPr>
-        <w:lastRenderedPageBreak/>
         <w:t>Result: Shows the proportion of each language within each genre. English dominates most genres, but Spanish and Portuguese are also significant in certain genres.</w:t>
       </w:r>
     </w:p>
@@ -4931,6 +5023,7 @@
   <w:style w:type="character" w:default="1" w:styleId="DefaultParagraphFont">
     <w:name w:val="Default Paragraph Font"/>
     <w:uiPriority w:val="1"/>
+    <w:semiHidden/>
     <w:unhideWhenUsed/>
   </w:style>
   <w:style w:type="table" w:default="1" w:styleId="TableNormal">

</xml_diff>